<commit_message>
test(corpus): rebuild the Office and PDF corpus with stable LibreOffice 24.2
Regenerate the 34 DOCX, XLSX, PPTX, ODT, ODS, ODP and PDF fixtures with a
stable LibreOffice release, record reproducibility (timestamps and
tool-generated IDs only), list every file's requirement in the README,
and run the build script's tests in verify.
</commit_message>
<xml_diff>
--- a/corpus/docx/headings-outline.docx
+++ b/corpus/docx/headings-outline.docx
@@ -1,6 +1,6 @@
 
 <file path=word/document.xml><?xml version="1.0" encoding="utf-8"?>
-<w:document xmlns:o="urn:schemas-microsoft-com:office:office" xmlns:r="http://schemas.openxmlformats.org/officeDocument/2006/relationships" xmlns:v="urn:schemas-microsoft-com:vml" xmlns:w="http://schemas.openxmlformats.org/wordprocessingml/2006/main" xmlns:w10="urn:schemas-microsoft-com:office:word" xmlns:wp="http://schemas.openxmlformats.org/drawingml/2006/wordprocessingDrawing" xmlns:pic="http://schemas.openxmlformats.org/drawingml/2006/picture" xmlns:wps="http://schemas.microsoft.com/office/word/2010/wordprocessingShape" xmlns:wpg="http://schemas.microsoft.com/office/word/2010/wordprocessingGroup" xmlns:mc="http://schemas.openxmlformats.org/markup-compatibility/2006" xmlns:wp14="http://schemas.microsoft.com/office/word/2010/wordprocessingDrawing" xmlns:w14="http://schemas.microsoft.com/office/word/2010/wordml" xmlns:w15="http://schemas.microsoft.com/office/word/2012/wordml" mc:Ignorable="w14 wp14 w15">
+<w:document xmlns:o="urn:schemas-microsoft-com:office:office" xmlns:r="http://schemas.openxmlformats.org/officeDocument/2006/relationships" xmlns:v="urn:schemas-microsoft-com:vml" xmlns:w="http://schemas.openxmlformats.org/wordprocessingml/2006/main" xmlns:w10="urn:schemas-microsoft-com:office:word" xmlns:wp="http://schemas.openxmlformats.org/drawingml/2006/wordprocessingDrawing" xmlns:wps="http://schemas.microsoft.com/office/word/2010/wordprocessingShape" xmlns:wpg="http://schemas.microsoft.com/office/word/2010/wordprocessingGroup" xmlns:mc="http://schemas.openxmlformats.org/markup-compatibility/2006" xmlns:wp14="http://schemas.microsoft.com/office/word/2010/wordprocessingDrawing" xmlns:w14="http://schemas.microsoft.com/office/word/2010/wordml" xmlns:w15="http://schemas.microsoft.com/office/word/2012/wordml" mc:Ignorable="w14 wp14 w15">
   <w:body>
     <w:p>
       <w:pPr>
@@ -8,6 +8,7 @@
         <w:bidi w:val="0"/>
         <w:spacing w:before="240" w:after="120"/>
         <w:ind w:hanging="0" w:start="0"/>
+        <w:jc w:val="start"/>
         <w:rPr/>
       </w:pPr>
       <w:r>
@@ -19,6 +20,7 @@
       <w:pPr>
         <w:pStyle w:val="Normal"/>
         <w:bidi w:val="0"/>
+        <w:jc w:val="start"/>
         <w:rPr/>
       </w:pPr>
       <w:r>
@@ -31,6 +33,7 @@
         <w:pStyle w:val="Heading2"/>
         <w:bidi w:val="0"/>
         <w:ind w:hanging="0" w:start="0"/>
+        <w:jc w:val="start"/>
         <w:rPr/>
       </w:pPr>
       <w:r>
@@ -42,6 +45,7 @@
       <w:pPr>
         <w:pStyle w:val="Normal"/>
         <w:bidi w:val="0"/>
+        <w:jc w:val="start"/>
         <w:rPr/>
       </w:pPr>
       <w:r>
@@ -70,6 +74,7 @@
         </w:numPr>
         <w:bidi w:val="0"/>
         <w:ind w:start="720"/>
+        <w:jc w:val="start"/>
         <w:outlineLvl w:val="2"/>
         <w:rPr/>
       </w:pPr>
@@ -82,6 +87,7 @@
       <w:pPr>
         <w:pStyle w:val="Normal"/>
         <w:bidi w:val="0"/>
+        <w:jc w:val="start"/>
         <w:rPr/>
       </w:pPr>
       <w:r>
@@ -94,6 +100,7 @@
         <w:pStyle w:val="Heading2"/>
         <w:bidi w:val="0"/>
         <w:ind w:hanging="0" w:start="0"/>
+        <w:jc w:val="start"/>
         <w:rPr/>
       </w:pPr>
       <w:r>
@@ -105,6 +112,7 @@
       <w:pPr>
         <w:pStyle w:val="Normal"/>
         <w:bidi w:val="0"/>
+        <w:jc w:val="start"/>
         <w:rPr/>
       </w:pPr>
       <w:r>
@@ -116,6 +124,7 @@
       <w:pPr>
         <w:pStyle w:val="Normal"/>
         <w:bidi w:val="0"/>
+        <w:jc w:val="start"/>
         <w:rPr/>
       </w:pPr>
       <w:r>
@@ -127,6 +136,7 @@
       <w:pPr>
         <w:pStyle w:val="Normal"/>
         <w:bidi w:val="0"/>
+        <w:jc w:val="start"/>
         <w:rPr/>
       </w:pPr>
       <w:r>
@@ -138,6 +148,7 @@
       <w:pPr>
         <w:pStyle w:val="Normal"/>
         <w:bidi w:val="0"/>
+        <w:jc w:val="start"/>
         <w:rPr/>
       </w:pPr>
       <w:r>
@@ -149,6 +160,7 @@
       <w:pPr>
         <w:pStyle w:val="Normal"/>
         <w:bidi w:val="0"/>
+        <w:jc w:val="start"/>
         <w:rPr/>
       </w:pPr>
       <w:r>
@@ -160,6 +172,7 @@
       <w:pPr>
         <w:pStyle w:val="Normal"/>
         <w:bidi w:val="0"/>
+        <w:jc w:val="start"/>
         <w:rPr/>
       </w:pPr>
       <w:r>
@@ -171,6 +184,7 @@
       <w:pPr>
         <w:pStyle w:val="Normal"/>
         <w:bidi w:val="0"/>
+        <w:jc w:val="start"/>
         <w:rPr/>
       </w:pPr>
       <w:r>
@@ -182,6 +196,7 @@
       <w:pPr>
         <w:pStyle w:val="Normal"/>
         <w:bidi w:val="0"/>
+        <w:jc w:val="start"/>
         <w:rPr/>
       </w:pPr>
       <w:r>
@@ -193,6 +208,7 @@
       <w:pPr>
         <w:pStyle w:val="Normal"/>
         <w:bidi w:val="0"/>
+        <w:jc w:val="start"/>
         <w:rPr/>
       </w:pPr>
       <w:r>
@@ -204,6 +220,7 @@
       <w:pPr>
         <w:pStyle w:val="Normal"/>
         <w:bidi w:val="0"/>
+        <w:jc w:val="start"/>
         <w:rPr/>
       </w:pPr>
       <w:r>
@@ -215,6 +232,7 @@
       <w:pPr>
         <w:pStyle w:val="Normal"/>
         <w:bidi w:val="0"/>
+        <w:jc w:val="start"/>
         <w:rPr/>
       </w:pPr>
       <w:r>
@@ -226,6 +244,7 @@
       <w:pPr>
         <w:pStyle w:val="Normal"/>
         <w:bidi w:val="0"/>
+        <w:jc w:val="start"/>
         <w:rPr/>
       </w:pPr>
       <w:r>
@@ -237,6 +256,7 @@
       <w:pPr>
         <w:pStyle w:val="Normal"/>
         <w:bidi w:val="0"/>
+        <w:jc w:val="start"/>
         <w:rPr/>
       </w:pPr>
       <w:r>
@@ -248,6 +268,7 @@
       <w:pPr>
         <w:pStyle w:val="Normal"/>
         <w:bidi w:val="0"/>
+        <w:jc w:val="start"/>
         <w:rPr/>
       </w:pPr>
       <w:r>
@@ -259,6 +280,7 @@
       <w:pPr>
         <w:pStyle w:val="Normal"/>
         <w:bidi w:val="0"/>
+        <w:jc w:val="start"/>
         <w:rPr/>
       </w:pPr>
       <w:r>
@@ -270,6 +292,7 @@
       <w:pPr>
         <w:pStyle w:val="Normal"/>
         <w:bidi w:val="0"/>
+        <w:jc w:val="start"/>
         <w:rPr/>
       </w:pPr>
       <w:r>
@@ -281,6 +304,7 @@
       <w:pPr>
         <w:pStyle w:val="Normal"/>
         <w:bidi w:val="0"/>
+        <w:jc w:val="start"/>
         <w:rPr/>
       </w:pPr>
       <w:r>
@@ -292,6 +316,7 @@
       <w:pPr>
         <w:pStyle w:val="Normal"/>
         <w:bidi w:val="0"/>
+        <w:jc w:val="start"/>
         <w:rPr/>
       </w:pPr>
       <w:r>
@@ -303,6 +328,7 @@
       <w:pPr>
         <w:pStyle w:val="Normal"/>
         <w:bidi w:val="0"/>
+        <w:jc w:val="start"/>
         <w:rPr/>
       </w:pPr>
       <w:r>
@@ -327,12 +353,13 @@
 </file>
 
 <file path=word/footer1.xml><?xml version="1.0" encoding="utf-8"?>
-<w:ftr xmlns:o="urn:schemas-microsoft-com:office:office" xmlns:r="http://schemas.openxmlformats.org/officeDocument/2006/relationships" xmlns:v="urn:schemas-microsoft-com:vml" xmlns:w="http://schemas.openxmlformats.org/wordprocessingml/2006/main" xmlns:w10="urn:schemas-microsoft-com:office:word" xmlns:wp="http://schemas.openxmlformats.org/drawingml/2006/wordprocessingDrawing" xmlns:pic="http://schemas.openxmlformats.org/drawingml/2006/picture" xmlns:wps="http://schemas.microsoft.com/office/word/2010/wordprocessingShape" xmlns:wpg="http://schemas.microsoft.com/office/word/2010/wordprocessingGroup" xmlns:mc="http://schemas.openxmlformats.org/markup-compatibility/2006" xmlns:wp14="http://schemas.microsoft.com/office/word/2010/wordprocessingDrawing" xmlns:w14="http://schemas.microsoft.com/office/word/2010/wordml" xmlns:w15="http://schemas.microsoft.com/office/word/2012/wordml" mc:Ignorable="w14 wp14 w15">
+<w:ftr xmlns:o="urn:schemas-microsoft-com:office:office" xmlns:r="http://schemas.openxmlformats.org/officeDocument/2006/relationships" xmlns:v="urn:schemas-microsoft-com:vml" xmlns:w="http://schemas.openxmlformats.org/wordprocessingml/2006/main" xmlns:w10="urn:schemas-microsoft-com:office:word" xmlns:wp="http://schemas.openxmlformats.org/drawingml/2006/wordprocessingDrawing" xmlns:wps="http://schemas.microsoft.com/office/word/2010/wordprocessingShape" xmlns:wpg="http://schemas.microsoft.com/office/word/2010/wordprocessingGroup" xmlns:mc="http://schemas.openxmlformats.org/markup-compatibility/2006" xmlns:wp14="http://schemas.microsoft.com/office/word/2010/wordprocessingDrawing" xmlns:w14="http://schemas.microsoft.com/office/word/2010/wordml" xmlns:w15="http://schemas.microsoft.com/office/word/2012/wordml" mc:Ignorable="w14 wp14 w15">
   <w:p>
     <w:pPr>
       <w:pStyle w:val="Footer"/>
       <w:suppressLineNumbers/>
       <w:bidi w:val="0"/>
+      <w:jc w:val="start"/>
       <w:rPr/>
     </w:pPr>
     <w:r>
@@ -364,12 +391,13 @@
 </file>
 
 <file path=word/header1.xml><?xml version="1.0" encoding="utf-8"?>
-<w:hdr xmlns:o="urn:schemas-microsoft-com:office:office" xmlns:r="http://schemas.openxmlformats.org/officeDocument/2006/relationships" xmlns:v="urn:schemas-microsoft-com:vml" xmlns:w="http://schemas.openxmlformats.org/wordprocessingml/2006/main" xmlns:w10="urn:schemas-microsoft-com:office:word" xmlns:wp="http://schemas.openxmlformats.org/drawingml/2006/wordprocessingDrawing" xmlns:pic="http://schemas.openxmlformats.org/drawingml/2006/picture" xmlns:wps="http://schemas.microsoft.com/office/word/2010/wordprocessingShape" xmlns:wpg="http://schemas.microsoft.com/office/word/2010/wordprocessingGroup" xmlns:mc="http://schemas.openxmlformats.org/markup-compatibility/2006" xmlns:wp14="http://schemas.microsoft.com/office/word/2010/wordprocessingDrawing" xmlns:w14="http://schemas.microsoft.com/office/word/2010/wordml" xmlns:w15="http://schemas.microsoft.com/office/word/2012/wordml" mc:Ignorable="w14 wp14 w15">
+<w:hdr xmlns:o="urn:schemas-microsoft-com:office:office" xmlns:r="http://schemas.openxmlformats.org/officeDocument/2006/relationships" xmlns:v="urn:schemas-microsoft-com:vml" xmlns:w="http://schemas.openxmlformats.org/wordprocessingml/2006/main" xmlns:w10="urn:schemas-microsoft-com:office:word" xmlns:wp="http://schemas.openxmlformats.org/drawingml/2006/wordprocessingDrawing" xmlns:wps="http://schemas.microsoft.com/office/word/2010/wordprocessingShape" xmlns:wpg="http://schemas.microsoft.com/office/word/2010/wordprocessingGroup" xmlns:mc="http://schemas.openxmlformats.org/markup-compatibility/2006" xmlns:wp14="http://schemas.microsoft.com/office/word/2010/wordprocessingDrawing" xmlns:w14="http://schemas.microsoft.com/office/word/2010/wordml" xmlns:w15="http://schemas.microsoft.com/office/word/2012/wordml" mc:Ignorable="w14 wp14 w15">
   <w:p>
     <w:pPr>
       <w:pStyle w:val="Header"/>
       <w:suppressLineNumbers/>
       <w:bidi w:val="0"/>
+      <w:jc w:val="start"/>
       <w:rPr/>
     </w:pPr>
     <w:r>
@@ -385,8 +413,8 @@
   <w:abstractNum w:abstractNumId="1">
     <w:lvl w:ilvl="0">
       <w:start w:val="1"/>
+      <w:pStyle w:val="Heading1"/>
       <w:numFmt w:val="none"/>
-      <w:pStyle w:val="Heading1"/>
       <w:suff w:val="nothing"/>
       <w:lvlText w:val=""/>
       <w:lvlJc w:val="start"/>
@@ -399,8 +427,8 @@
     </w:lvl>
     <w:lvl w:ilvl="1">
       <w:start w:val="1"/>
+      <w:pStyle w:val="Heading2"/>
       <w:numFmt w:val="none"/>
-      <w:pStyle w:val="Heading2"/>
       <w:suff w:val="nothing"/>
       <w:lvlText w:val=""/>
       <w:lvlJc w:val="start"/>
@@ -514,7 +542,7 @@
   <w:docDefaults>
     <w:rPrDefault>
       <w:rPr>
-        <w:rFonts w:ascii="Liberation Serif" w:hAnsi="Liberation Serif" w:eastAsia="Noto Serif CJK SC" w:cs="Noto Sans"/>
+        <w:rFonts w:ascii="Liberation Serif" w:hAnsi="Liberation Serif" w:eastAsia="WenQuanYi Zen Hei" w:cs="FreeSans"/>
         <w:kern w:val="2"/>
         <w:sz w:val="24"/>
         <w:szCs w:val="24"/>
@@ -536,7 +564,7 @@
       <w:bidi w:val="0"/>
     </w:pPr>
     <w:rPr>
-      <w:rFonts w:ascii="Liberation Serif" w:hAnsi="Liberation Serif" w:eastAsia="Noto Serif CJK SC" w:cs="Noto Sans"/>
+      <w:rFonts w:ascii="Liberation Serif" w:hAnsi="Liberation Serif" w:eastAsia="WenQuanYi Zen Hei" w:cs="FreeSans"/>
       <w:color w:val="auto"/>
       <w:kern w:val="2"/>
       <w:sz w:val="24"/>
@@ -545,7 +573,7 @@
     </w:rPr>
   </w:style>
   <w:style w:type="paragraph" w:styleId="Heading1">
-    <w:name w:val="heading 1"/>
+    <w:name w:val="Heading 1"/>
     <w:basedOn w:val="Heading"/>
     <w:next w:val="BodyText"/>
     <w:qFormat/>
@@ -565,7 +593,7 @@
     </w:rPr>
   </w:style>
   <w:style w:type="paragraph" w:styleId="Heading2">
-    <w:name w:val="heading 2"/>
+    <w:name w:val="Heading 2"/>
     <w:basedOn w:val="Heading"/>
     <w:next w:val="BodyText"/>
     <w:qFormat/>
@@ -601,7 +629,7 @@
       <w:spacing w:before="240" w:after="120"/>
     </w:pPr>
     <w:rPr>
-      <w:rFonts w:ascii="Liberation Sans" w:hAnsi="Liberation Sans" w:eastAsia="Noto Sans CJK SC" w:cs="Noto Sans"/>
+      <w:rFonts w:ascii="Liberation Sans" w:hAnsi="Liberation Sans" w:eastAsia="WenQuanYi Zen Hei" w:cs="FreeSans"/>
       <w:sz w:val="28"/>
       <w:szCs w:val="28"/>
     </w:rPr>
@@ -619,11 +647,11 @@
     <w:basedOn w:val="BodyText"/>
     <w:pPr/>
     <w:rPr>
-      <w:rFonts w:cs="Noto Sans"/>
+      <w:rFonts w:cs="FreeSans"/>
     </w:rPr>
   </w:style>
   <w:style w:type="paragraph" w:styleId="Caption">
-    <w:name w:val="caption"/>
+    <w:name w:val="Caption"/>
     <w:basedOn w:val="Normal"/>
     <w:qFormat/>
     <w:pPr>
@@ -631,7 +659,7 @@
       <w:spacing w:before="120" w:after="120"/>
     </w:pPr>
     <w:rPr>
-      <w:rFonts w:cs="Noto Sans"/>
+      <w:rFonts w:cs="FreeSans"/>
       <w:i/>
       <w:iCs/>
       <w:sz w:val="24"/>
@@ -646,7 +674,7 @@
       <w:suppressLineNumbers/>
     </w:pPr>
     <w:rPr>
-      <w:rFonts w:cs="Noto Sans"/>
+      <w:rFonts w:cs="FreeSans"/>
     </w:rPr>
   </w:style>
   <w:style w:type="paragraph" w:styleId="HeaderandFooter">
@@ -664,7 +692,7 @@
     <w:rPr/>
   </w:style>
   <w:style w:type="paragraph" w:styleId="Header">
-    <w:name w:val="header"/>
+    <w:name w:val="Header"/>
     <w:basedOn w:val="HeaderandFooter"/>
     <w:pPr>
       <w:suppressLineNumbers/>
@@ -672,7 +700,7 @@
     <w:rPr/>
   </w:style>
   <w:style w:type="paragraph" w:styleId="Footer">
-    <w:name w:val="footer"/>
+    <w:name w:val="Footer"/>
     <w:basedOn w:val="HeaderandFooter"/>
     <w:pPr>
       <w:suppressLineNumbers/>
@@ -690,37 +718,37 @@
         <a:srgbClr val="000000"/>
       </a:dk1>
       <a:lt1>
-        <a:srgbClr val="FFFFFF"/>
+        <a:srgbClr val="ffffff"/>
       </a:lt1>
       <a:dk2>
         <a:srgbClr val="000000"/>
       </a:dk2>
       <a:lt2>
-        <a:srgbClr val="FFFFFF"/>
+        <a:srgbClr val="ffffff"/>
       </a:lt2>
       <a:accent1>
-        <a:srgbClr val="18A303"/>
+        <a:srgbClr val="18a303"/>
       </a:accent1>
       <a:accent2>
-        <a:srgbClr val="0369A3"/>
+        <a:srgbClr val="0369a3"/>
       </a:accent2>
       <a:accent3>
-        <a:srgbClr val="A33E03"/>
+        <a:srgbClr val="a33e03"/>
       </a:accent3>
       <a:accent4>
-        <a:srgbClr val="8E03A3"/>
+        <a:srgbClr val="8e03a3"/>
       </a:accent4>
       <a:accent5>
-        <a:srgbClr val="C99C00"/>
+        <a:srgbClr val="c99c00"/>
       </a:accent5>
       <a:accent6>
-        <a:srgbClr val="C9211E"/>
+        <a:srgbClr val="c9211e"/>
       </a:accent6>
       <a:hlink>
-        <a:srgbClr val="0000EE"/>
+        <a:srgbClr val="0000ee"/>
       </a:hlink>
       <a:folHlink>
-        <a:srgbClr val="551A8B"/>
+        <a:srgbClr val="551a8b"/>
       </a:folHlink>
     </a:clrScheme>
     <a:fontScheme name="Office">

</xml_diff>